<commit_message>
Update financial integration plan with accounting structure
Reflects accountant's input on expense classification, cash accounts, and multi-currency setup in the QuickBooks integration plan.

Replit-Commit-Author: Agent
Replit-Commit-Session-Id: 12beb878-664d-437c-a3e7-185f28818206
Replit-Commit-Checkpoint-Type: full_checkpoint
Replit-Commit-Event-Id: d1e367da-e914-410f-a32a-e9afe5fdb3af
Replit-Commit-Screenshot-Url: https://storage.googleapis.com/screenshot-production-us-central1/88db65bc-9bcc-4a6a-806b-09ca2d405322/12beb878-664d-437c-a3e7-185f28818206/vOKgfcU
Replit-Helium-Checkpoint-Created: true
</commit_message>
<xml_diff>
--- a/exports/AgriChain-Integration-Plan.docx
+++ b/exports/AgriChain-Integration-Plan.docx
@@ -219,7 +219,7 @@
     </w:p>
     <w:bookmarkEnd w:id="9"/>
     <w:bookmarkEnd w:id="10"/>
-    <w:bookmarkStart w:id="18" w:name="part-a-quickbooks-integration-plan"/>
+    <w:bookmarkStart w:id="22" w:name="part-a-quickbooks-integration-plan"/>
     <w:p>
       <w:pPr>
         <w:pStyle w:val="Heading1"/>
@@ -595,13 +595,22 @@
       </w:tr>
     </w:tbl>
     <w:bookmarkEnd w:id="13"/>
-    <w:bookmarkStart w:id="14" w:name="X21843a81ce1b6524ef3d5d3812020dedb0c62f5"/>
+    <w:bookmarkStart w:id="18" w:name="chart-of-accounts-confirmed-by-finance"/>
     <w:p>
       <w:pPr>
         <w:pStyle w:val="Heading2"/>
       </w:pPr>
       <w:r>
-        <w:t xml:space="preserve">4. Chart-of-accounts mapping (needs the accountant’s sign-off)</w:t>
+        <w:t xml:space="preserve">4. Chart of accounts (confirmed by finance)</w:t>
+      </w:r>
+    </w:p>
+    <w:bookmarkStart w:id="14" w:name="X6a7f351ed31ce32179af085dc29467fa145e813"/>
+    <w:p>
+      <w:pPr>
+        <w:pStyle w:val="Heading3"/>
+      </w:pPr>
+      <w:r>
+        <w:t xml:space="preserve">4a. Expense classification — four categories</w:t>
       </w:r>
     </w:p>
     <w:p>
@@ -609,66 +618,7 @@
         <w:pStyle w:val="FirstParagraph"/>
       </w:pPr>
       <w:r>
-        <w:t xml:space="preserve">Before any code, finance decides which QuickBooks accounts these events hit — e.g. </w:t>
-      </w:r>
-      <w:r>
-        <w:t xml:space="preserve">“Crop Purchases (COGS)”</w:t>
-      </w:r>
-      <w:r>
-        <w:t xml:space="preserve">,</w:t>
-      </w:r>
-      <w:r>
-        <w:t xml:space="preserve"> </w:t>
-      </w:r>
-      <w:r>
-        <w:t xml:space="preserve">“Mobile Money Clearing”</w:t>
-      </w:r>
-      <w:r>
-        <w:t xml:space="preserve">,</w:t>
-      </w:r>
-      <w:r>
-        <w:t xml:space="preserve"> </w:t>
-      </w:r>
-      <w:r>
-        <w:t xml:space="preserve">“Cash Float — Field Agents”</w:t>
-      </w:r>
-      <w:r>
-        <w:t xml:space="preserve">,</w:t>
-      </w:r>
-      <w:r>
-        <w:t xml:space="preserve"> </w:t>
-      </w:r>
-      <w:r>
-        <w:t xml:space="preserve">“Sales Revenue”</w:t>
-      </w:r>
-      <w:r>
-        <w:t xml:space="preserve">.</w:t>
-      </w:r>
-      <w:r>
-        <w:t xml:space="preserve"> </w:t>
-      </w:r>
-      <w:r>
-        <w:rPr>
-          <w:b/>
-          <w:bCs/>
-        </w:rPr>
-        <w:t xml:space="preserve">This is a business decision, not a technical one.</w:t>
-      </w:r>
-      <w:r>
-        <w:t xml:space="preserve"> </w:t>
-      </w:r>
-      <w:r>
-        <w:t xml:space="preserve">A simple mapping table will be provided for finance to complete.</w:t>
-      </w:r>
-    </w:p>
-    <w:bookmarkEnd w:id="14"/>
-    <w:bookmarkStart w:id="15" w:name="phasing"/>
-    <w:p>
-      <w:pPr>
-        <w:pStyle w:val="Heading2"/>
-      </w:pPr>
-      <w:r>
-        <w:t xml:space="preserve">5. Phasing</w:t>
+        <w:t xml:space="preserve">Per finance, all expenses are classified into four groups, which become the expense/COGS structure in QuickBooks:</w:t>
       </w:r>
     </w:p>
     <w:tbl>
@@ -694,6 +644,764 @@
               <w:pStyle w:val="Compact"/>
             </w:pPr>
             <w:r>
+              <w:t xml:space="preserve">Category</w:t>
+            </w:r>
+          </w:p>
+        </w:tc>
+        <w:tc>
+          <w:tcPr/>
+          <w:p>
+            <w:pPr>
+              <w:pStyle w:val="Compact"/>
+            </w:pPr>
+            <w:r>
+              <w:t xml:space="preserve">What it covers</w:t>
+            </w:r>
+          </w:p>
+        </w:tc>
+        <w:tc>
+          <w:tcPr/>
+          <w:p>
+            <w:pPr>
+              <w:pStyle w:val="Compact"/>
+            </w:pPr>
+            <w:r>
+              <w:t xml:space="preserve">AgriChain events that post here</w:t>
+            </w:r>
+          </w:p>
+        </w:tc>
+      </w:tr>
+      <w:tr>
+        <w:tc>
+          <w:tcPr/>
+          <w:p>
+            <w:pPr>
+              <w:pStyle w:val="Compact"/>
+            </w:pPr>
+            <w:r>
+              <w:rPr>
+                <w:b/>
+                <w:bCs/>
+              </w:rPr>
+              <w:t xml:space="preserve">Cost of Goods (COGS)</w:t>
+            </w:r>
+          </w:p>
+        </w:tc>
+        <w:tc>
+          <w:tcPr/>
+          <w:p>
+            <w:pPr>
+              <w:pStyle w:val="Compact"/>
+            </w:pPr>
+            <w:r>
+              <w:t xml:space="preserve">Part and full payments for coffee</w:t>
+            </w:r>
+          </w:p>
+        </w:tc>
+        <w:tc>
+          <w:tcPr/>
+          <w:p>
+            <w:pPr>
+              <w:pStyle w:val="Compact"/>
+            </w:pPr>
+            <w:r>
+              <w:t xml:space="preserve">Farmer &amp; supplier delivery payments (part-payments and final payments)</w:t>
+            </w:r>
+          </w:p>
+        </w:tc>
+      </w:tr>
+      <w:tr>
+        <w:tc>
+          <w:tcPr/>
+          <w:p>
+            <w:pPr>
+              <w:pStyle w:val="Compact"/>
+            </w:pPr>
+            <w:r>
+              <w:rPr>
+                <w:b/>
+                <w:bCs/>
+              </w:rPr>
+              <w:t xml:space="preserve">Operating expenses</w:t>
+            </w:r>
+          </w:p>
+        </w:tc>
+        <w:tc>
+          <w:tcPr/>
+          <w:p>
+            <w:pPr>
+              <w:pStyle w:val="Compact"/>
+            </w:pPr>
+            <w:r>
+              <w:t xml:space="preserve">Variable costs that are not fixed costs — e.g. milling, transport, daily subsistence allowances</w:t>
+            </w:r>
+          </w:p>
+        </w:tc>
+        <w:tc>
+          <w:tcPr/>
+          <w:p>
+            <w:pPr>
+              <w:pStyle w:val="Compact"/>
+            </w:pPr>
+            <w:r>
+              <w:t xml:space="preserve">Milling/processing costs, transport, field per-diems, mobile-money merchant fees, bank charges</w:t>
+            </w:r>
+          </w:p>
+        </w:tc>
+      </w:tr>
+      <w:tr>
+        <w:tc>
+          <w:tcPr/>
+          <w:p>
+            <w:pPr>
+              <w:pStyle w:val="Compact"/>
+            </w:pPr>
+            <w:r>
+              <w:rPr>
+                <w:b/>
+                <w:bCs/>
+              </w:rPr>
+              <w:t xml:space="preserve">Fixed costs</w:t>
+            </w:r>
+          </w:p>
+        </w:tc>
+        <w:tc>
+          <w:tcPr/>
+          <w:p>
+            <w:pPr>
+              <w:pStyle w:val="Compact"/>
+            </w:pPr>
+            <w:r>
+              <w:t xml:space="preserve">Recurring overheads — water, electricity, rent, legal retainer, accounting fees</w:t>
+            </w:r>
+          </w:p>
+        </w:tc>
+        <w:tc>
+          <w:tcPr/>
+          <w:p>
+            <w:pPr>
+              <w:pStyle w:val="Compact"/>
+            </w:pPr>
+            <w:r>
+              <w:t xml:space="preserve">Entered in QuickBooks directly (not generated by AgriChain field activity)</w:t>
+            </w:r>
+          </w:p>
+        </w:tc>
+      </w:tr>
+      <w:tr>
+        <w:tc>
+          <w:tcPr/>
+          <w:p>
+            <w:pPr>
+              <w:pStyle w:val="Compact"/>
+            </w:pPr>
+            <w:r>
+              <w:rPr>
+                <w:b/>
+                <w:bCs/>
+              </w:rPr>
+              <w:t xml:space="preserve">Capex (capital expenditure)</w:t>
+            </w:r>
+          </w:p>
+        </w:tc>
+        <w:tc>
+          <w:tcPr/>
+          <w:p>
+            <w:pPr>
+              <w:pStyle w:val="Compact"/>
+            </w:pPr>
+            <w:r>
+              <w:t xml:space="preserve">Purchase of equipment — computers, vehicles, factory/milling equipment</w:t>
+            </w:r>
+          </w:p>
+        </w:tc>
+        <w:tc>
+          <w:tcPr/>
+          <w:p>
+            <w:pPr>
+              <w:pStyle w:val="Compact"/>
+            </w:pPr>
+            <w:r>
+              <w:t xml:space="preserve">Entered in QuickBooks directly; capitalised as fixed assets, not expensed</w:t>
+            </w:r>
+          </w:p>
+        </w:tc>
+      </w:tr>
+    </w:tbl>
+    <w:p>
+      <w:pPr>
+        <w:pStyle w:val="BlockText"/>
+      </w:pPr>
+      <w:r>
+        <w:rPr>
+          <w:b/>
+          <w:bCs/>
+        </w:rPr>
+        <w:t xml:space="preserve">Note on Capex:</w:t>
+      </w:r>
+      <w:r>
+        <w:t xml:space="preserve"> </w:t>
+      </w:r>
+      <w:r>
+        <w:t xml:space="preserve">capital purchases are</w:t>
+      </w:r>
+      <w:r>
+        <w:t xml:space="preserve"> </w:t>
+      </w:r>
+      <w:r>
+        <w:rPr>
+          <w:b/>
+          <w:bCs/>
+        </w:rPr>
+        <w:t xml:space="preserve">balance-sheet assets</w:t>
+      </w:r>
+      <w:r>
+        <w:t xml:space="preserve"> </w:t>
+      </w:r>
+      <w:r>
+        <w:t xml:space="preserve">(fixed assets), depreciated over time — not expensed in the period of purchase. We will set these up as fixed-asset accounts with depreciation, rather than expense accounts. Finance to confirm depreciation method/useful-life per asset class.</w:t>
+      </w:r>
+    </w:p>
+    <w:bookmarkEnd w:id="14"/>
+    <w:bookmarkStart w:id="15" w:name="X2579d5bc91c8fead8bc9c68603d49d91a5cdc77"/>
+    <w:p>
+      <w:pPr>
+        <w:pStyle w:val="Heading3"/>
+      </w:pPr>
+      <w:r>
+        <w:t xml:space="preserve">4b. Bank &amp; mobile-money accounts (the cash side)</w:t>
+      </w:r>
+    </w:p>
+    <w:p>
+      <w:pPr>
+        <w:pStyle w:val="FirstParagraph"/>
+      </w:pPr>
+      <w:r>
+        <w:t xml:space="preserve">Finance holds funds in</w:t>
+      </w:r>
+      <w:r>
+        <w:t xml:space="preserve"> </w:t>
+      </w:r>
+      <w:r>
+        <w:rPr>
+          <w:b/>
+          <w:bCs/>
+        </w:rPr>
+        <w:t xml:space="preserve">two Stanbic bank accounts</w:t>
+      </w:r>
+      <w:r>
+        <w:t xml:space="preserve"> </w:t>
+      </w:r>
+      <w:r>
+        <w:t xml:space="preserve">— one</w:t>
+      </w:r>
+      <w:r>
+        <w:t xml:space="preserve"> </w:t>
+      </w:r>
+      <w:r>
+        <w:rPr>
+          <w:b/>
+          <w:bCs/>
+        </w:rPr>
+        <w:t xml:space="preserve">USD</w:t>
+      </w:r>
+      <w:r>
+        <w:t xml:space="preserve"> </w:t>
+      </w:r>
+      <w:r>
+        <w:t xml:space="preserve">and one</w:t>
+      </w:r>
+      <w:r>
+        <w:t xml:space="preserve"> </w:t>
+      </w:r>
+      <w:r>
+        <w:rPr>
+          <w:b/>
+          <w:bCs/>
+        </w:rPr>
+        <w:t xml:space="preserve">UGX</w:t>
+      </w:r>
+      <w:r>
+        <w:t xml:space="preserve">. Money moves from Stanbic to the mobile-money wallets to finance field activities. Modelled in QuickBooks as:</w:t>
+      </w:r>
+    </w:p>
+    <w:tbl>
+      <w:tblPr>
+        <w:tblStyle w:val="Table"/>
+        <w:tblW w:type="pct" w:w="5000"/>
+        <w:tblLayout w:type="fixed"/>
+        <w:tblLook w:firstRow="1" w:lastRow="0" w:firstColumn="0" w:lastColumn="0" w:noHBand="0" w:noVBand="0" w:val="0020"/>
+      </w:tblPr>
+      <w:tblGrid>
+        <w:gridCol w:w="2640"/>
+        <w:gridCol w:w="2640"/>
+        <w:gridCol w:w="2640"/>
+      </w:tblGrid>
+      <w:tr>
+        <w:trPr>
+          <w:tblHeader w:val="on"/>
+        </w:trPr>
+        <w:tc>
+          <w:tcPr/>
+          <w:p>
+            <w:pPr>
+              <w:pStyle w:val="Compact"/>
+            </w:pPr>
+            <w:r>
+              <w:t xml:space="preserve">QuickBooks account</w:t>
+            </w:r>
+          </w:p>
+        </w:tc>
+        <w:tc>
+          <w:tcPr/>
+          <w:p>
+            <w:pPr>
+              <w:pStyle w:val="Compact"/>
+            </w:pPr>
+            <w:r>
+              <w:t xml:space="preserve">Type</w:t>
+            </w:r>
+          </w:p>
+        </w:tc>
+        <w:tc>
+          <w:tcPr/>
+          <w:p>
+            <w:pPr>
+              <w:pStyle w:val="Compact"/>
+            </w:pPr>
+            <w:r>
+              <w:t xml:space="preserve">Purpose</w:t>
+            </w:r>
+          </w:p>
+        </w:tc>
+      </w:tr>
+      <w:tr>
+        <w:tc>
+          <w:tcPr/>
+          <w:p>
+            <w:pPr>
+              <w:pStyle w:val="Compact"/>
+            </w:pPr>
+            <w:r>
+              <w:rPr>
+                <w:b/>
+                <w:bCs/>
+              </w:rPr>
+              <w:t xml:space="preserve">Stanbic — UGX</w:t>
+            </w:r>
+          </w:p>
+        </w:tc>
+        <w:tc>
+          <w:tcPr/>
+          <w:p>
+            <w:pPr>
+              <w:pStyle w:val="Compact"/>
+            </w:pPr>
+            <w:r>
+              <w:t xml:space="preserve">Bank</w:t>
+            </w:r>
+          </w:p>
+        </w:tc>
+        <w:tc>
+          <w:tcPr/>
+          <w:p>
+            <w:pPr>
+              <w:pStyle w:val="Compact"/>
+            </w:pPr>
+            <w:r>
+              <w:t xml:space="preserve">Primary operating account (UGX)</w:t>
+            </w:r>
+          </w:p>
+        </w:tc>
+      </w:tr>
+      <w:tr>
+        <w:tc>
+          <w:tcPr/>
+          <w:p>
+            <w:pPr>
+              <w:pStyle w:val="Compact"/>
+            </w:pPr>
+            <w:r>
+              <w:rPr>
+                <w:b/>
+                <w:bCs/>
+              </w:rPr>
+              <w:t xml:space="preserve">Stanbic — USD</w:t>
+            </w:r>
+          </w:p>
+        </w:tc>
+        <w:tc>
+          <w:tcPr/>
+          <w:p>
+            <w:pPr>
+              <w:pStyle w:val="Compact"/>
+            </w:pPr>
+            <w:r>
+              <w:t xml:space="preserve">Bank</w:t>
+            </w:r>
+          </w:p>
+        </w:tc>
+        <w:tc>
+          <w:tcPr/>
+          <w:p>
+            <w:pPr>
+              <w:pStyle w:val="Compact"/>
+            </w:pPr>
+            <w:r>
+              <w:t xml:space="preserve">USD account (e.g. export receipts / FX)</w:t>
+            </w:r>
+          </w:p>
+        </w:tc>
+      </w:tr>
+      <w:tr>
+        <w:tc>
+          <w:tcPr/>
+          <w:p>
+            <w:pPr>
+              <w:pStyle w:val="Compact"/>
+            </w:pPr>
+            <w:r>
+              <w:rPr>
+                <w:b/>
+                <w:bCs/>
+              </w:rPr>
+              <w:t xml:space="preserve">MTN MoMo Wallet</w:t>
+            </w:r>
+          </w:p>
+        </w:tc>
+        <w:tc>
+          <w:tcPr/>
+          <w:p>
+            <w:pPr>
+              <w:pStyle w:val="Compact"/>
+            </w:pPr>
+            <w:r>
+              <w:t xml:space="preserve">Bank / Cash</w:t>
+            </w:r>
+          </w:p>
+        </w:tc>
+        <w:tc>
+          <w:tcPr/>
+          <w:p>
+            <w:pPr>
+              <w:pStyle w:val="Compact"/>
+            </w:pPr>
+            <w:r>
+              <w:t xml:space="preserve">Float held in the MTN business wallet</w:t>
+            </w:r>
+          </w:p>
+        </w:tc>
+      </w:tr>
+      <w:tr>
+        <w:tc>
+          <w:tcPr/>
+          <w:p>
+            <w:pPr>
+              <w:pStyle w:val="Compact"/>
+            </w:pPr>
+            <w:r>
+              <w:rPr>
+                <w:b/>
+                <w:bCs/>
+              </w:rPr>
+              <w:t xml:space="preserve">Airtel Money Wallet</w:t>
+            </w:r>
+          </w:p>
+        </w:tc>
+        <w:tc>
+          <w:tcPr/>
+          <w:p>
+            <w:pPr>
+              <w:pStyle w:val="Compact"/>
+            </w:pPr>
+            <w:r>
+              <w:t xml:space="preserve">Bank / Cash</w:t>
+            </w:r>
+          </w:p>
+        </w:tc>
+        <w:tc>
+          <w:tcPr/>
+          <w:p>
+            <w:pPr>
+              <w:pStyle w:val="Compact"/>
+            </w:pPr>
+            <w:r>
+              <w:t xml:space="preserve">Float held in the Airtel business wallet</w:t>
+            </w:r>
+          </w:p>
+        </w:tc>
+      </w:tr>
+    </w:tbl>
+    <w:p>
+      <w:pPr>
+        <w:pStyle w:val="BodyText"/>
+      </w:pPr>
+      <w:r>
+        <w:rPr>
+          <w:b/>
+          <w:bCs/>
+        </w:rPr>
+        <w:t xml:space="preserve">Funding flow:</w:t>
+      </w:r>
+      <w:r>
+        <w:t xml:space="preserve"> </w:t>
+      </w:r>
+      <w:r>
+        <w:t xml:space="preserve">moving money</w:t>
+      </w:r>
+      <w:r>
+        <w:t xml:space="preserve"> </w:t>
+      </w:r>
+      <w:r>
+        <w:rPr>
+          <w:b/>
+          <w:bCs/>
+        </w:rPr>
+        <w:t xml:space="preserve">Stanbic → MoMo wallet</w:t>
+      </w:r>
+      <w:r>
+        <w:t xml:space="preserve"> </w:t>
+      </w:r>
+      <w:r>
+        <w:t xml:space="preserve">is recorded as a</w:t>
+      </w:r>
+      <w:r>
+        <w:t xml:space="preserve"> </w:t>
+      </w:r>
+      <w:r>
+        <w:rPr>
+          <w:b/>
+          <w:bCs/>
+        </w:rPr>
+        <w:t xml:space="preserve">bank Transfer</w:t>
+      </w:r>
+      <w:r>
+        <w:t xml:space="preserve"> </w:t>
+      </w:r>
+      <w:r>
+        <w:t xml:space="preserve">between two asset accounts (no expense). Field payments then move</w:t>
+      </w:r>
+      <w:r>
+        <w:t xml:space="preserve"> </w:t>
+      </w:r>
+      <w:r>
+        <w:rPr>
+          <w:b/>
+          <w:bCs/>
+        </w:rPr>
+        <w:t xml:space="preserve">wallet → farmer/supplier</w:t>
+      </w:r>
+      <w:r>
+        <w:t xml:space="preserve"> </w:t>
+      </w:r>
+      <w:r>
+        <w:t xml:space="preserve">and post to</w:t>
+      </w:r>
+      <w:r>
+        <w:t xml:space="preserve"> </w:t>
+      </w:r>
+      <w:r>
+        <w:rPr>
+          <w:b/>
+          <w:bCs/>
+        </w:rPr>
+        <w:t xml:space="preserve">COGS</w:t>
+      </w:r>
+      <w:r>
+        <w:t xml:space="preserve">. This keeps the wallet balance in QuickBooks reconciled against the operator’s wallet at all times.</w:t>
+      </w:r>
+    </w:p>
+    <w:bookmarkEnd w:id="15"/>
+    <w:bookmarkStart w:id="16" w:name="c.-multi-currency"/>
+    <w:p>
+      <w:pPr>
+        <w:pStyle w:val="Heading3"/>
+      </w:pPr>
+      <w:r>
+        <w:t xml:space="preserve">4c. Multi-currency</w:t>
+      </w:r>
+    </w:p>
+    <w:p>
+      <w:pPr>
+        <w:pStyle w:val="FirstParagraph"/>
+      </w:pPr>
+      <w:r>
+        <w:t xml:space="preserve">Because there are USD and UGX accounts, QuickBooks</w:t>
+      </w:r>
+      <w:r>
+        <w:t xml:space="preserve"> </w:t>
+      </w:r>
+      <w:r>
+        <w:rPr>
+          <w:b/>
+          <w:bCs/>
+        </w:rPr>
+        <w:t xml:space="preserve">multi-currency</w:t>
+      </w:r>
+      <w:r>
+        <w:t xml:space="preserve"> </w:t>
+      </w:r>
+      <w:r>
+        <w:t xml:space="preserve">must be enabled. Decisions for finance:</w:t>
+      </w:r>
+      <w:r>
+        <w:t xml:space="preserve"> </w:t>
+      </w:r>
+      <w:r>
+        <w:t xml:space="preserve">-</w:t>
+      </w:r>
+      <w:r>
+        <w:t xml:space="preserve"> </w:t>
+      </w:r>
+      <w:r>
+        <w:rPr>
+          <w:b/>
+          <w:bCs/>
+        </w:rPr>
+        <w:t xml:space="preserve">Home/base currency</w:t>
+      </w:r>
+      <w:r>
+        <w:t xml:space="preserve"> </w:t>
+      </w:r>
+      <w:r>
+        <w:t xml:space="preserve">— assumed</w:t>
+      </w:r>
+      <w:r>
+        <w:t xml:space="preserve"> </w:t>
+      </w:r>
+      <w:r>
+        <w:rPr>
+          <w:b/>
+          <w:bCs/>
+        </w:rPr>
+        <w:t xml:space="preserve">UGX</w:t>
+      </w:r>
+      <w:r>
+        <w:t xml:space="preserve"> </w:t>
+      </w:r>
+      <w:r>
+        <w:t xml:space="preserve">(operations and purchases are UGX); please confirm.</w:t>
+      </w:r>
+      <w:r>
+        <w:t xml:space="preserve"> </w:t>
+      </w:r>
+      <w:r>
+        <w:t xml:space="preserve">- The</w:t>
+      </w:r>
+      <w:r>
+        <w:t xml:space="preserve"> </w:t>
+      </w:r>
+      <w:r>
+        <w:rPr>
+          <w:b/>
+          <w:bCs/>
+        </w:rPr>
+        <w:t xml:space="preserve">USD</w:t>
+      </w:r>
+      <w:r>
+        <w:t xml:space="preserve"> </w:t>
+      </w:r>
+      <w:r>
+        <w:t xml:space="preserve">account is for export sales / FX holdings; QuickBooks will track realised/unrealised</w:t>
+      </w:r>
+      <w:r>
+        <w:t xml:space="preserve"> </w:t>
+      </w:r>
+      <w:r>
+        <w:rPr>
+          <w:b/>
+          <w:bCs/>
+        </w:rPr>
+        <w:t xml:space="preserve">FX gains &amp; losses</w:t>
+      </w:r>
+      <w:r>
+        <w:t xml:space="preserve"> </w:t>
+      </w:r>
+      <w:r>
+        <w:t xml:space="preserve">automatically once multi-currency is on.</w:t>
+      </w:r>
+    </w:p>
+    <w:bookmarkEnd w:id="16"/>
+    <w:bookmarkStart w:id="17" w:name="d.-revenue"/>
+    <w:p>
+      <w:pPr>
+        <w:pStyle w:val="Heading3"/>
+      </w:pPr>
+      <w:r>
+        <w:t xml:space="preserve">4d. Revenue</w:t>
+      </w:r>
+    </w:p>
+    <w:p>
+      <w:pPr>
+        <w:pStyle w:val="FirstParagraph"/>
+      </w:pPr>
+      <w:r>
+        <w:t xml:space="preserve">Coffee sales to buyers post to a</w:t>
+      </w:r>
+      <w:r>
+        <w:t xml:space="preserve"> </w:t>
+      </w:r>
+      <w:r>
+        <w:rPr>
+          <w:b/>
+          <w:bCs/>
+        </w:rPr>
+        <w:t xml:space="preserve">Sales Revenue</w:t>
+      </w:r>
+      <w:r>
+        <w:t xml:space="preserve"> </w:t>
+      </w:r>
+      <w:r>
+        <w:t xml:space="preserve">account (USD or UGX depending on the sale), with buyers as QuickBooks</w:t>
+      </w:r>
+      <w:r>
+        <w:t xml:space="preserve"> </w:t>
+      </w:r>
+      <w:r>
+        <w:rPr>
+          <w:b/>
+          <w:bCs/>
+        </w:rPr>
+        <w:t xml:space="preserve">Customers</w:t>
+      </w:r>
+      <w:r>
+        <w:t xml:space="preserve">.</w:t>
+      </w:r>
+    </w:p>
+    <w:bookmarkEnd w:id="17"/>
+    <w:bookmarkEnd w:id="18"/>
+    <w:bookmarkStart w:id="19" w:name="phasing"/>
+    <w:p>
+      <w:pPr>
+        <w:pStyle w:val="Heading2"/>
+      </w:pPr>
+      <w:r>
+        <w:t xml:space="preserve">5. Phasing</w:t>
+      </w:r>
+    </w:p>
+    <w:tbl>
+      <w:tblPr>
+        <w:tblStyle w:val="Table"/>
+        <w:tblW w:type="pct" w:w="5000"/>
+        <w:tblLayout w:type="fixed"/>
+        <w:tblLook w:firstRow="1" w:lastRow="0" w:firstColumn="0" w:lastColumn="0" w:noHBand="0" w:noVBand="0" w:val="0020"/>
+      </w:tblPr>
+      <w:tblGrid>
+        <w:gridCol w:w="2640"/>
+        <w:gridCol w:w="2640"/>
+        <w:gridCol w:w="2640"/>
+      </w:tblGrid>
+      <w:tr>
+        <w:trPr>
+          <w:tblHeader w:val="on"/>
+        </w:trPr>
+        <w:tc>
+          <w:tcPr/>
+          <w:p>
+            <w:pPr>
+              <w:pStyle w:val="Compact"/>
+            </w:pPr>
+            <w:r>
               <w:t xml:space="preserve">Phase</w:t>
             </w:r>
           </w:p>
@@ -917,8 +1625,8 @@
         </w:tc>
       </w:tr>
     </w:tbl>
-    <w:bookmarkEnd w:id="15"/>
-    <w:bookmarkStart w:id="16" w:name="effort-key-dependency"/>
+    <w:bookmarkEnd w:id="19"/>
+    <w:bookmarkStart w:id="20" w:name="effort-key-dependency"/>
     <w:p>
       <w:pPr>
         <w:pStyle w:val="Heading2"/>
@@ -967,8 +1675,8 @@
         <w:t xml:space="preserve">(see Part B).</w:t>
       </w:r>
     </w:p>
-    <w:bookmarkEnd w:id="16"/>
-    <w:bookmarkStart w:id="17" w:name="connection-method"/>
+    <w:bookmarkEnd w:id="20"/>
+    <w:bookmarkStart w:id="21" w:name="connection-method"/>
     <w:p>
       <w:pPr>
         <w:pStyle w:val="Heading2"/>
@@ -992,9 +1700,9 @@
         </w:pict>
       </w:r>
     </w:p>
-    <w:bookmarkEnd w:id="17"/>
-    <w:bookmarkEnd w:id="18"/>
-    <w:bookmarkStart w:id="24" w:name="X7019905889c353ecaef38a510775b1e4768548f"/>
+    <w:bookmarkEnd w:id="21"/>
+    <w:bookmarkEnd w:id="22"/>
+    <w:bookmarkStart w:id="28" w:name="X7019905889c353ecaef38a510775b1e4768548f"/>
     <w:p>
       <w:pPr>
         <w:pStyle w:val="Heading1"/>
@@ -1009,7 +1717,7 @@
         <w:t xml:space="preserve">“being our own gateway”</w:t>
       </w:r>
     </w:p>
-    <w:bookmarkStart w:id="19" w:name="the-apis-exist-and-are-open-to-us"/>
+    <w:bookmarkStart w:id="23" w:name="the-apis-exist-and-are-open-to-us"/>
     <w:p>
       <w:pPr>
         <w:pStyle w:val="Heading2"/>
@@ -1163,8 +1871,8 @@
         <w:t xml:space="preserve">= receiving payments from buyers.</w:t>
       </w:r>
     </w:p>
-    <w:bookmarkEnd w:id="19"/>
-    <w:bookmarkStart w:id="20" w:name="X870f5eccf9e80a1f7740e3c751dd013b967a9b9"/>
+    <w:bookmarkEnd w:id="23"/>
+    <w:bookmarkStart w:id="24" w:name="X870f5eccf9e80a1f7740e3c751dd013b967a9b9"/>
     <w:p>
       <w:pPr>
         <w:pStyle w:val="Heading2"/>
@@ -1451,8 +2159,8 @@
         <w:t xml:space="preserve">. For running AgriChain itself, option (A) is all that is needed and is far faster.</w:t>
       </w:r>
     </w:p>
-    <w:bookmarkEnd w:id="20"/>
-    <w:bookmarkStart w:id="21" w:name="how-money-actually-reaches-the-bank"/>
+    <w:bookmarkEnd w:id="24"/>
+    <w:bookmarkStart w:id="25" w:name="how-money-actually-reaches-the-bank"/>
     <w:p>
       <w:pPr>
         <w:pStyle w:val="Heading2"/>
@@ -1611,8 +2319,8 @@
         <w:t xml:space="preserve">(MTN charges roughly 1% for individual merchants and 2% for business merchants on received payments).</w:t>
       </w:r>
     </w:p>
-    <w:bookmarkEnd w:id="21"/>
-    <w:bookmarkStart w:id="22" w:name="recommendation"/>
+    <w:bookmarkEnd w:id="25"/>
+    <w:bookmarkStart w:id="26" w:name="recommendation"/>
     <w:p>
       <w:pPr>
         <w:pStyle w:val="Heading2"/>
@@ -1704,8 +2412,8 @@
         </w:pict>
       </w:r>
     </w:p>
-    <w:bookmarkEnd w:id="22"/>
-    <w:bookmarkStart w:id="23" w:name="appendix-sandbox-configuration-values"/>
+    <w:bookmarkEnd w:id="26"/>
+    <w:bookmarkStart w:id="27" w:name="appendix-sandbox-configuration-values"/>
     <w:p>
       <w:pPr>
         <w:pStyle w:val="Heading2"/>
@@ -2104,8 +2812,8 @@
         <w:t xml:space="preserve">.</w:t>
       </w:r>
     </w:p>
-    <w:bookmarkEnd w:id="23"/>
-    <w:bookmarkEnd w:id="24"/>
+    <w:bookmarkEnd w:id="27"/>
+    <w:bookmarkEnd w:id="28"/>
     <w:sectPr>
       <w:footnotePr>
         <w:numRestart w:val="eachSect"/>

</xml_diff>